<commit_message>
Adição código fonte e atualização história de usuário
Foi adicionado o código fonte da modelagem do caso de uso "Realizar Cadastro" e também foi atualizado o arquivo de História de Usuário, incluindo imagem do protótipo, atualização também no Roteiro de Teste
</commit_message>
<xml_diff>
--- a/1.Requisitos/Casos de Uso/INST360 - História de Usuário 1.docx
+++ b/1.Requisitos/Casos de Uso/INST360 - História de Usuário 1.docx
@@ -1,6 +1,6 @@
 
 <file path=word/document.xml><?xml version="1.0" encoding="utf-8"?>
-<w:document xmlns:wpc="http://schemas.microsoft.com/office/word/2010/wordprocessingCanvas" xmlns:cx="http://schemas.microsoft.com/office/drawing/2014/chartex" xmlns:mc="http://schemas.openxmlformats.org/markup-compatibility/2006" xmlns:o="urn:schemas-microsoft-com:office:office" xmlns:r="http://schemas.openxmlformats.org/officeDocument/2006/relationships" xmlns:m="http://schemas.openxmlformats.org/officeDocument/2006/math" xmlns:v="urn:schemas-microsoft-com:vml" xmlns:wp14="http://schemas.microsoft.com/office/word/2010/wordprocessingDrawing" xmlns:wp="http://schemas.openxmlformats.org/drawingml/2006/wordprocessingDrawing" xmlns:w10="urn:schemas-microsoft-com:office:word" xmlns:w="http://schemas.openxmlformats.org/wordprocessingml/2006/main" xmlns:w14="http://schemas.microsoft.com/office/word/2010/wordml" xmlns:w15="http://schemas.microsoft.com/office/word/2012/wordml" xmlns:w16se="http://schemas.microsoft.com/office/word/2015/wordml/symex" xmlns:wpg="http://schemas.microsoft.com/office/word/2010/wordprocessingGroup" xmlns:wpi="http://schemas.microsoft.com/office/word/2010/wordprocessingInk" xmlns:wne="http://schemas.microsoft.com/office/word/2006/wordml" xmlns:wps="http://schemas.microsoft.com/office/word/2010/wordprocessingShape" mc:Ignorable="w14 w15 w16se wp14">
+<w:document xmlns:wpc="http://schemas.microsoft.com/office/word/2010/wordprocessingCanvas" xmlns:cx="http://schemas.microsoft.com/office/drawing/2014/chartex" xmlns:cx1="http://schemas.microsoft.com/office/drawing/2015/9/8/chartex" xmlns:cx2="http://schemas.microsoft.com/office/drawing/2015/10/21/chartex" xmlns:cx3="http://schemas.microsoft.com/office/drawing/2016/5/9/chartex" xmlns:cx4="http://schemas.microsoft.com/office/drawing/2016/5/10/chartex" xmlns:cx5="http://schemas.microsoft.com/office/drawing/2016/5/11/chartex" xmlns:cx6="http://schemas.microsoft.com/office/drawing/2016/5/12/chartex" xmlns:cx7="http://schemas.microsoft.com/office/drawing/2016/5/13/chartex" xmlns:cx8="http://schemas.microsoft.com/office/drawing/2016/5/14/chartex" xmlns:mc="http://schemas.openxmlformats.org/markup-compatibility/2006" xmlns:aink="http://schemas.microsoft.com/office/drawing/2016/ink" xmlns:am3d="http://schemas.microsoft.com/office/drawing/2017/model3d" xmlns:o="urn:schemas-microsoft-com:office:office" xmlns:oel="http://schemas.microsoft.com/office/2019/extlst" xmlns:r="http://schemas.openxmlformats.org/officeDocument/2006/relationships" xmlns:m="http://schemas.openxmlformats.org/officeDocument/2006/math" xmlns:v="urn:schemas-microsoft-com:vml" xmlns:wp14="http://schemas.microsoft.com/office/word/2010/wordprocessingDrawing" xmlns:wp="http://schemas.openxmlformats.org/drawingml/2006/wordprocessingDrawing" xmlns:w10="urn:schemas-microsoft-com:office:word" xmlns:w="http://schemas.openxmlformats.org/wordprocessingml/2006/main" xmlns:w14="http://schemas.microsoft.com/office/word/2010/wordml" xmlns:w15="http://schemas.microsoft.com/office/word/2012/wordml" xmlns:w16cex="http://schemas.microsoft.com/office/word/2018/wordml/cex" xmlns:w16cid="http://schemas.microsoft.com/office/word/2016/wordml/cid" xmlns:w16="http://schemas.microsoft.com/office/word/2018/wordml" xmlns:w16du="http://schemas.microsoft.com/office/word/2023/wordml/word16du" xmlns:w16sdtdh="http://schemas.microsoft.com/office/word/2020/wordml/sdtdatahash" xmlns:w16sdtfl="http://schemas.microsoft.com/office/word/2024/wordml/sdtformatlock" xmlns:w16se="http://schemas.microsoft.com/office/word/2015/wordml/symex" xmlns:wpg="http://schemas.microsoft.com/office/word/2010/wordprocessingGroup" xmlns:wpi="http://schemas.microsoft.com/office/word/2010/wordprocessingInk" xmlns:wne="http://schemas.microsoft.com/office/word/2006/wordml" xmlns:wps="http://schemas.microsoft.com/office/word/2010/wordprocessingShape" mc:Ignorable="w14 w15 w16se w16cid w16 w16cex w16sdtdh w16sdtfl w16du wp14">
   <w:background w:color="FFFFFF"/>
   <w:body>
     <w:p>
@@ -850,8 +850,6 @@
               </w:rPr>
               <w:t>Mensagem de “Usuário já cadastrado e em processo de validação"</w:t>
             </w:r>
-            <w:bookmarkStart w:id="3" w:name="_GoBack"/>
-            <w:bookmarkEnd w:id="3"/>
           </w:p>
         </w:tc>
       </w:tr>
@@ -866,6 +864,7 @@
         <w:pStyle w:val="EPP-Seonivel1"/>
       </w:pPr>
       <w:r>
+        <w:lastRenderedPageBreak/>
         <w:t>tEM PROTÓTIPO?</w:t>
       </w:r>
     </w:p>
@@ -888,7 +887,41 @@
           <w:iCs/>
           <w:color w:val="auto"/>
         </w:rPr>
-        <w:t>Protótipo disponível em:</w:t>
+        <w:drawing>
+          <wp:inline distT="0" distB="0" distL="0" distR="0" wp14:anchorId="0AF3470D" wp14:editId="0F40C9BE">
+            <wp:extent cx="6120130" cy="6274435"/>
+            <wp:effectExtent l="0" t="0" r="0" b="0"/>
+            <wp:docPr id="1091095562" name="Imagem 1"/>
+            <wp:cNvGraphicFramePr>
+              <a:graphicFrameLocks xmlns:a="http://schemas.openxmlformats.org/drawingml/2006/main" noChangeAspect="1"/>
+            </wp:cNvGraphicFramePr>
+            <a:graphic xmlns:a="http://schemas.openxmlformats.org/drawingml/2006/main">
+              <a:graphicData uri="http://schemas.openxmlformats.org/drawingml/2006/picture">
+                <pic:pic xmlns:pic="http://schemas.openxmlformats.org/drawingml/2006/picture">
+                  <pic:nvPicPr>
+                    <pic:cNvPr id="1091095562" name=""/>
+                    <pic:cNvPicPr/>
+                  </pic:nvPicPr>
+                  <pic:blipFill>
+                    <a:blip r:embed="rId7"/>
+                    <a:stretch>
+                      <a:fillRect/>
+                    </a:stretch>
+                  </pic:blipFill>
+                  <pic:spPr>
+                    <a:xfrm>
+                      <a:off x="0" y="0"/>
+                      <a:ext cx="6120130" cy="6274435"/>
+                    </a:xfrm>
+                    <a:prstGeom prst="rect">
+                      <a:avLst/>
+                    </a:prstGeom>
+                  </pic:spPr>
+                </pic:pic>
+              </a:graphicData>
+            </a:graphic>
+          </wp:inline>
+        </w:drawing>
       </w:r>
     </w:p>
     <w:p>
@@ -902,30 +935,6 @@
           <w:color w:val="auto"/>
         </w:rPr>
       </w:pPr>
-    </w:p>
-    <w:p>
-      <w:pPr>
-        <w:pStyle w:val="EPP-Comentario"/>
-        <w:rPr>
-          <w:b/>
-          <w:bCs/>
-          <w:i w:val="0"/>
-          <w:iCs/>
-          <w:color w:val="auto"/>
-        </w:rPr>
-      </w:pPr>
-      <w:hyperlink r:id="rId7" w:history="1">
-        <w:r>
-          <w:rPr>
-            <w:rStyle w:val="Hyperlink"/>
-            <w:b/>
-            <w:bCs/>
-            <w:i w:val="0"/>
-            <w:iCs/>
-          </w:rPr>
-          <w:t>https://github.com/victor-exner/Instituto-360/tree/main/3.Implementacao</w:t>
-        </w:r>
-      </w:hyperlink>
     </w:p>
     <w:sectPr>
       <w:headerReference w:type="default" r:id="rId8"/>
@@ -940,7 +949,7 @@
 </file>
 
 <file path=word/endnotes.xml><?xml version="1.0" encoding="utf-8"?>
-<w:endnotes xmlns:wpc="http://schemas.microsoft.com/office/word/2010/wordprocessingCanvas" xmlns:cx="http://schemas.microsoft.com/office/drawing/2014/chartex" xmlns:mc="http://schemas.openxmlformats.org/markup-compatibility/2006" xmlns:o="urn:schemas-microsoft-com:office:office" xmlns:r="http://schemas.openxmlformats.org/officeDocument/2006/relationships" xmlns:m="http://schemas.openxmlformats.org/officeDocument/2006/math" xmlns:v="urn:schemas-microsoft-com:vml" xmlns:wp14="http://schemas.microsoft.com/office/word/2010/wordprocessingDrawing" xmlns:wp="http://schemas.openxmlformats.org/drawingml/2006/wordprocessingDrawing" xmlns:w10="urn:schemas-microsoft-com:office:word" xmlns:w="http://schemas.openxmlformats.org/wordprocessingml/2006/main" xmlns:w14="http://schemas.microsoft.com/office/word/2010/wordml" xmlns:w15="http://schemas.microsoft.com/office/word/2012/wordml" xmlns:w16se="http://schemas.microsoft.com/office/word/2015/wordml/symex" xmlns:wpg="http://schemas.microsoft.com/office/word/2010/wordprocessingGroup" xmlns:wpi="http://schemas.microsoft.com/office/word/2010/wordprocessingInk" xmlns:wne="http://schemas.microsoft.com/office/word/2006/wordml" xmlns:wps="http://schemas.microsoft.com/office/word/2010/wordprocessingShape" mc:Ignorable="w14 w15 w16se wp14">
+<w:endnotes xmlns:wpc="http://schemas.microsoft.com/office/word/2010/wordprocessingCanvas" xmlns:cx="http://schemas.microsoft.com/office/drawing/2014/chartex" xmlns:cx1="http://schemas.microsoft.com/office/drawing/2015/9/8/chartex" xmlns:cx2="http://schemas.microsoft.com/office/drawing/2015/10/21/chartex" xmlns:cx3="http://schemas.microsoft.com/office/drawing/2016/5/9/chartex" xmlns:cx4="http://schemas.microsoft.com/office/drawing/2016/5/10/chartex" xmlns:cx5="http://schemas.microsoft.com/office/drawing/2016/5/11/chartex" xmlns:cx6="http://schemas.microsoft.com/office/drawing/2016/5/12/chartex" xmlns:cx7="http://schemas.microsoft.com/office/drawing/2016/5/13/chartex" xmlns:cx8="http://schemas.microsoft.com/office/drawing/2016/5/14/chartex" xmlns:mc="http://schemas.openxmlformats.org/markup-compatibility/2006" xmlns:aink="http://schemas.microsoft.com/office/drawing/2016/ink" xmlns:am3d="http://schemas.microsoft.com/office/drawing/2017/model3d" xmlns:o="urn:schemas-microsoft-com:office:office" xmlns:oel="http://schemas.microsoft.com/office/2019/extlst" xmlns:r="http://schemas.openxmlformats.org/officeDocument/2006/relationships" xmlns:m="http://schemas.openxmlformats.org/officeDocument/2006/math" xmlns:v="urn:schemas-microsoft-com:vml" xmlns:wp14="http://schemas.microsoft.com/office/word/2010/wordprocessingDrawing" xmlns:wp="http://schemas.openxmlformats.org/drawingml/2006/wordprocessingDrawing" xmlns:w10="urn:schemas-microsoft-com:office:word" xmlns:w="http://schemas.openxmlformats.org/wordprocessingml/2006/main" xmlns:w14="http://schemas.microsoft.com/office/word/2010/wordml" xmlns:w15="http://schemas.microsoft.com/office/word/2012/wordml" xmlns:w16cex="http://schemas.microsoft.com/office/word/2018/wordml/cex" xmlns:w16cid="http://schemas.microsoft.com/office/word/2016/wordml/cid" xmlns:w16="http://schemas.microsoft.com/office/word/2018/wordml" xmlns:w16du="http://schemas.microsoft.com/office/word/2023/wordml/word16du" xmlns:w16sdtdh="http://schemas.microsoft.com/office/word/2020/wordml/sdtdatahash" xmlns:w16sdtfl="http://schemas.microsoft.com/office/word/2024/wordml/sdtformatlock" xmlns:w16se="http://schemas.microsoft.com/office/word/2015/wordml/symex" xmlns:wpg="http://schemas.microsoft.com/office/word/2010/wordprocessingGroup" xmlns:wpi="http://schemas.microsoft.com/office/word/2010/wordprocessingInk" xmlns:wne="http://schemas.microsoft.com/office/word/2006/wordml" xmlns:wps="http://schemas.microsoft.com/office/word/2010/wordprocessingShape" mc:Ignorable="w14 w15 w16se w16cid w16 w16cex w16sdtdh w16sdtfl w16du wp14">
   <w:endnote w:type="separator" w:id="-1">
     <w:p>
       <w:r>
@@ -959,7 +968,7 @@
 </file>
 
 <file path=word/footer1.xml><?xml version="1.0" encoding="utf-8"?>
-<w:ftr xmlns:wpc="http://schemas.microsoft.com/office/word/2010/wordprocessingCanvas" xmlns:cx="http://schemas.microsoft.com/office/drawing/2014/chartex" xmlns:mc="http://schemas.openxmlformats.org/markup-compatibility/2006" xmlns:o="urn:schemas-microsoft-com:office:office" xmlns:r="http://schemas.openxmlformats.org/officeDocument/2006/relationships" xmlns:m="http://schemas.openxmlformats.org/officeDocument/2006/math" xmlns:v="urn:schemas-microsoft-com:vml" xmlns:wp14="http://schemas.microsoft.com/office/word/2010/wordprocessingDrawing" xmlns:wp="http://schemas.openxmlformats.org/drawingml/2006/wordprocessingDrawing" xmlns:w10="urn:schemas-microsoft-com:office:word" xmlns:w="http://schemas.openxmlformats.org/wordprocessingml/2006/main" xmlns:w14="http://schemas.microsoft.com/office/word/2010/wordml" xmlns:w15="http://schemas.microsoft.com/office/word/2012/wordml" xmlns:w16se="http://schemas.microsoft.com/office/word/2015/wordml/symex" xmlns:wpg="http://schemas.microsoft.com/office/word/2010/wordprocessingGroup" xmlns:wpi="http://schemas.microsoft.com/office/word/2010/wordprocessingInk" xmlns:wne="http://schemas.microsoft.com/office/word/2006/wordml" xmlns:wps="http://schemas.microsoft.com/office/word/2010/wordprocessingShape" mc:Ignorable="w14 w15 w16se wp14">
+<w:ftr xmlns:wpc="http://schemas.microsoft.com/office/word/2010/wordprocessingCanvas" xmlns:cx="http://schemas.microsoft.com/office/drawing/2014/chartex" xmlns:cx1="http://schemas.microsoft.com/office/drawing/2015/9/8/chartex" xmlns:cx2="http://schemas.microsoft.com/office/drawing/2015/10/21/chartex" xmlns:cx3="http://schemas.microsoft.com/office/drawing/2016/5/9/chartex" xmlns:cx4="http://schemas.microsoft.com/office/drawing/2016/5/10/chartex" xmlns:cx5="http://schemas.microsoft.com/office/drawing/2016/5/11/chartex" xmlns:cx6="http://schemas.microsoft.com/office/drawing/2016/5/12/chartex" xmlns:cx7="http://schemas.microsoft.com/office/drawing/2016/5/13/chartex" xmlns:cx8="http://schemas.microsoft.com/office/drawing/2016/5/14/chartex" xmlns:mc="http://schemas.openxmlformats.org/markup-compatibility/2006" xmlns:aink="http://schemas.microsoft.com/office/drawing/2016/ink" xmlns:am3d="http://schemas.microsoft.com/office/drawing/2017/model3d" xmlns:o="urn:schemas-microsoft-com:office:office" xmlns:oel="http://schemas.microsoft.com/office/2019/extlst" xmlns:r="http://schemas.openxmlformats.org/officeDocument/2006/relationships" xmlns:m="http://schemas.openxmlformats.org/officeDocument/2006/math" xmlns:v="urn:schemas-microsoft-com:vml" xmlns:wp14="http://schemas.microsoft.com/office/word/2010/wordprocessingDrawing" xmlns:wp="http://schemas.openxmlformats.org/drawingml/2006/wordprocessingDrawing" xmlns:w10="urn:schemas-microsoft-com:office:word" xmlns:w="http://schemas.openxmlformats.org/wordprocessingml/2006/main" xmlns:w14="http://schemas.microsoft.com/office/word/2010/wordml" xmlns:w15="http://schemas.microsoft.com/office/word/2012/wordml" xmlns:w16cex="http://schemas.microsoft.com/office/word/2018/wordml/cex" xmlns:w16cid="http://schemas.microsoft.com/office/word/2016/wordml/cid" xmlns:w16="http://schemas.microsoft.com/office/word/2018/wordml" xmlns:w16du="http://schemas.microsoft.com/office/word/2023/wordml/word16du" xmlns:w16sdtdh="http://schemas.microsoft.com/office/word/2020/wordml/sdtdatahash" xmlns:w16sdtfl="http://schemas.microsoft.com/office/word/2024/wordml/sdtformatlock" xmlns:w16se="http://schemas.microsoft.com/office/word/2015/wordml/symex" xmlns:wpg="http://schemas.microsoft.com/office/word/2010/wordprocessingGroup" xmlns:wpi="http://schemas.microsoft.com/office/word/2010/wordprocessingInk" xmlns:wne="http://schemas.microsoft.com/office/word/2006/wordml" xmlns:wps="http://schemas.microsoft.com/office/word/2010/wordprocessingShape" mc:Ignorable="w14 w15 w16se w16cid w16 w16cex w16sdtdh w16sdtfl w16du wp14">
   <w:p>
     <w:pPr>
       <w:pStyle w:val="Rodap"/>
@@ -1004,7 +1013,6 @@
               <w:dataBinding w:prefixMappings="xmlns:ns0='http://schemas.openxmlformats.org/officeDocument/2006/extended-properties' " w:xpath="/ns0:Properties[1]/ns0:Manager[1]" w:storeItemID="{6668398D-A668-4E3E-A5EB-62B293D839F1}"/>
               <w:text/>
             </w:sdtPr>
-            <w:sdtEndPr/>
             <w:sdtContent>
               <w:r>
                 <w:t>&lt;Sigla do Projeto&gt; - &lt;Nome do Projeto&gt;</w:t>
@@ -1022,7 +1030,6 @@
               <w:dataBinding w:prefixMappings="xmlns:ns0='http://purl.org/dc/elements/1.1/' xmlns:ns1='http://schemas.openxmlformats.org/package/2006/metadata/core-properties' " w:xpath="/ns1:coreProperties[1]/ns0:subject[1]" w:storeItemID="{6C3C8BC8-F283-45AE-878A-BAB7291924A1}"/>
               <w:text/>
             </w:sdtPr>
-            <w:sdtEndPr/>
             <w:sdtContent>
               <w:r>
                 <w:t>Versão &lt;X&gt;</w:t>
@@ -1113,35 +1120,20 @@
     <w:pPr>
       <w:jc w:val="right"/>
     </w:pPr>
-    <w:proofErr w:type="spellStart"/>
     <w:r>
-      <w:t>vs</w:t>
+      <w:t xml:space="preserve">vs: </w:t>
     </w:r>
-    <w:proofErr w:type="spellEnd"/>
-    <w:r>
-      <w:t xml:space="preserve">: </w:t>
-    </w:r>
-    <w:r>
-      <w:fldChar w:fldCharType="begin"/>
-    </w:r>
-    <w:r>
-      <w:instrText xml:space="preserve"> DOCPROPERTY  "Versão Modelo"  \* MERGEFORMAT </w:instrText>
-    </w:r>
-    <w:r>
-      <w:fldChar w:fldCharType="separate"/>
-    </w:r>
-    <w:r>
-      <w:t>1</w:t>
-    </w:r>
-    <w:r>
-      <w:fldChar w:fldCharType="end"/>
-    </w:r>
+    <w:fldSimple w:instr=" DOCPROPERTY  &quot;Versão Modelo&quot;  \* MERGEFORMAT ">
+      <w:r>
+        <w:t>1</w:t>
+      </w:r>
+    </w:fldSimple>
   </w:p>
 </w:ftr>
 </file>
 
 <file path=word/footnotes.xml><?xml version="1.0" encoding="utf-8"?>
-<w:footnotes xmlns:wpc="http://schemas.microsoft.com/office/word/2010/wordprocessingCanvas" xmlns:cx="http://schemas.microsoft.com/office/drawing/2014/chartex" xmlns:mc="http://schemas.openxmlformats.org/markup-compatibility/2006" xmlns:o="urn:schemas-microsoft-com:office:office" xmlns:r="http://schemas.openxmlformats.org/officeDocument/2006/relationships" xmlns:m="http://schemas.openxmlformats.org/officeDocument/2006/math" xmlns:v="urn:schemas-microsoft-com:vml" xmlns:wp14="http://schemas.microsoft.com/office/word/2010/wordprocessingDrawing" xmlns:wp="http://schemas.openxmlformats.org/drawingml/2006/wordprocessingDrawing" xmlns:w10="urn:schemas-microsoft-com:office:word" xmlns:w="http://schemas.openxmlformats.org/wordprocessingml/2006/main" xmlns:w14="http://schemas.microsoft.com/office/word/2010/wordml" xmlns:w15="http://schemas.microsoft.com/office/word/2012/wordml" xmlns:w16se="http://schemas.microsoft.com/office/word/2015/wordml/symex" xmlns:wpg="http://schemas.microsoft.com/office/word/2010/wordprocessingGroup" xmlns:wpi="http://schemas.microsoft.com/office/word/2010/wordprocessingInk" xmlns:wne="http://schemas.microsoft.com/office/word/2006/wordml" xmlns:wps="http://schemas.microsoft.com/office/word/2010/wordprocessingShape" mc:Ignorable="w14 w15 w16se wp14">
+<w:footnotes xmlns:wpc="http://schemas.microsoft.com/office/word/2010/wordprocessingCanvas" xmlns:cx="http://schemas.microsoft.com/office/drawing/2014/chartex" xmlns:cx1="http://schemas.microsoft.com/office/drawing/2015/9/8/chartex" xmlns:cx2="http://schemas.microsoft.com/office/drawing/2015/10/21/chartex" xmlns:cx3="http://schemas.microsoft.com/office/drawing/2016/5/9/chartex" xmlns:cx4="http://schemas.microsoft.com/office/drawing/2016/5/10/chartex" xmlns:cx5="http://schemas.microsoft.com/office/drawing/2016/5/11/chartex" xmlns:cx6="http://schemas.microsoft.com/office/drawing/2016/5/12/chartex" xmlns:cx7="http://schemas.microsoft.com/office/drawing/2016/5/13/chartex" xmlns:cx8="http://schemas.microsoft.com/office/drawing/2016/5/14/chartex" xmlns:mc="http://schemas.openxmlformats.org/markup-compatibility/2006" xmlns:aink="http://schemas.microsoft.com/office/drawing/2016/ink" xmlns:am3d="http://schemas.microsoft.com/office/drawing/2017/model3d" xmlns:o="urn:schemas-microsoft-com:office:office" xmlns:oel="http://schemas.microsoft.com/office/2019/extlst" xmlns:r="http://schemas.openxmlformats.org/officeDocument/2006/relationships" xmlns:m="http://schemas.openxmlformats.org/officeDocument/2006/math" xmlns:v="urn:schemas-microsoft-com:vml" xmlns:wp14="http://schemas.microsoft.com/office/word/2010/wordprocessingDrawing" xmlns:wp="http://schemas.openxmlformats.org/drawingml/2006/wordprocessingDrawing" xmlns:w10="urn:schemas-microsoft-com:office:word" xmlns:w="http://schemas.openxmlformats.org/wordprocessingml/2006/main" xmlns:w14="http://schemas.microsoft.com/office/word/2010/wordml" xmlns:w15="http://schemas.microsoft.com/office/word/2012/wordml" xmlns:w16cex="http://schemas.microsoft.com/office/word/2018/wordml/cex" xmlns:w16cid="http://schemas.microsoft.com/office/word/2016/wordml/cid" xmlns:w16="http://schemas.microsoft.com/office/word/2018/wordml" xmlns:w16du="http://schemas.microsoft.com/office/word/2023/wordml/word16du" xmlns:w16sdtdh="http://schemas.microsoft.com/office/word/2020/wordml/sdtdatahash" xmlns:w16sdtfl="http://schemas.microsoft.com/office/word/2024/wordml/sdtformatlock" xmlns:w16se="http://schemas.microsoft.com/office/word/2015/wordml/symex" xmlns:wpg="http://schemas.microsoft.com/office/word/2010/wordprocessingGroup" xmlns:wpi="http://schemas.microsoft.com/office/word/2010/wordprocessingInk" xmlns:wne="http://schemas.microsoft.com/office/word/2006/wordml" xmlns:wps="http://schemas.microsoft.com/office/word/2010/wordprocessingShape" mc:Ignorable="w14 w15 w16se w16cid w16 w16cex w16sdtdh w16sdtfl w16du wp14">
   <w:footnote w:type="separator" w:id="-1">
     <w:p>
       <w:r>
@@ -1160,7 +1152,7 @@
 </file>
 
 <file path=word/header1.xml><?xml version="1.0" encoding="utf-8"?>
-<w:hdr xmlns:wpc="http://schemas.microsoft.com/office/word/2010/wordprocessingCanvas" xmlns:cx="http://schemas.microsoft.com/office/drawing/2014/chartex" xmlns:mc="http://schemas.openxmlformats.org/markup-compatibility/2006" xmlns:o="urn:schemas-microsoft-com:office:office" xmlns:r="http://schemas.openxmlformats.org/officeDocument/2006/relationships" xmlns:m="http://schemas.openxmlformats.org/officeDocument/2006/math" xmlns:v="urn:schemas-microsoft-com:vml" xmlns:wp14="http://schemas.microsoft.com/office/word/2010/wordprocessingDrawing" xmlns:wp="http://schemas.openxmlformats.org/drawingml/2006/wordprocessingDrawing" xmlns:w10="urn:schemas-microsoft-com:office:word" xmlns:w="http://schemas.openxmlformats.org/wordprocessingml/2006/main" xmlns:w14="http://schemas.microsoft.com/office/word/2010/wordml" xmlns:w15="http://schemas.microsoft.com/office/word/2012/wordml" xmlns:w16se="http://schemas.microsoft.com/office/word/2015/wordml/symex" xmlns:wpg="http://schemas.microsoft.com/office/word/2010/wordprocessingGroup" xmlns:wpi="http://schemas.microsoft.com/office/word/2010/wordprocessingInk" xmlns:wne="http://schemas.microsoft.com/office/word/2006/wordml" xmlns:wps="http://schemas.microsoft.com/office/word/2010/wordprocessingShape" mc:Ignorable="w14 w15 w16se wp14">
+<w:hdr xmlns:wpc="http://schemas.microsoft.com/office/word/2010/wordprocessingCanvas" xmlns:cx="http://schemas.microsoft.com/office/drawing/2014/chartex" xmlns:cx1="http://schemas.microsoft.com/office/drawing/2015/9/8/chartex" xmlns:cx2="http://schemas.microsoft.com/office/drawing/2015/10/21/chartex" xmlns:cx3="http://schemas.microsoft.com/office/drawing/2016/5/9/chartex" xmlns:cx4="http://schemas.microsoft.com/office/drawing/2016/5/10/chartex" xmlns:cx5="http://schemas.microsoft.com/office/drawing/2016/5/11/chartex" xmlns:cx6="http://schemas.microsoft.com/office/drawing/2016/5/12/chartex" xmlns:cx7="http://schemas.microsoft.com/office/drawing/2016/5/13/chartex" xmlns:cx8="http://schemas.microsoft.com/office/drawing/2016/5/14/chartex" xmlns:mc="http://schemas.openxmlformats.org/markup-compatibility/2006" xmlns:aink="http://schemas.microsoft.com/office/drawing/2016/ink" xmlns:am3d="http://schemas.microsoft.com/office/drawing/2017/model3d" xmlns:o="urn:schemas-microsoft-com:office:office" xmlns:oel="http://schemas.microsoft.com/office/2019/extlst" xmlns:r="http://schemas.openxmlformats.org/officeDocument/2006/relationships" xmlns:m="http://schemas.openxmlformats.org/officeDocument/2006/math" xmlns:v="urn:schemas-microsoft-com:vml" xmlns:wp14="http://schemas.microsoft.com/office/word/2010/wordprocessingDrawing" xmlns:wp="http://schemas.openxmlformats.org/drawingml/2006/wordprocessingDrawing" xmlns:w10="urn:schemas-microsoft-com:office:word" xmlns:w="http://schemas.openxmlformats.org/wordprocessingml/2006/main" xmlns:w14="http://schemas.microsoft.com/office/word/2010/wordml" xmlns:w15="http://schemas.microsoft.com/office/word/2012/wordml" xmlns:w16cex="http://schemas.microsoft.com/office/word/2018/wordml/cex" xmlns:w16cid="http://schemas.microsoft.com/office/word/2016/wordml/cid" xmlns:w16="http://schemas.microsoft.com/office/word/2018/wordml" xmlns:w16du="http://schemas.microsoft.com/office/word/2023/wordml/word16du" xmlns:w16sdtdh="http://schemas.microsoft.com/office/word/2020/wordml/sdtdatahash" xmlns:w16sdtfl="http://schemas.microsoft.com/office/word/2024/wordml/sdtformatlock" xmlns:w16se="http://schemas.microsoft.com/office/word/2015/wordml/symex" xmlns:wpg="http://schemas.microsoft.com/office/word/2010/wordprocessingGroup" xmlns:wpi="http://schemas.microsoft.com/office/word/2010/wordprocessingInk" xmlns:wne="http://schemas.microsoft.com/office/word/2006/wordml" xmlns:wps="http://schemas.microsoft.com/office/word/2010/wordprocessingShape" mc:Ignorable="w14 w15 w16se w16cid w16 w16cex w16sdtdh w16sdtfl w16du wp14">
   <w:tbl>
     <w:tblPr>
       <w:tblW w:w="9720" w:type="dxa"/>
@@ -1222,7 +1214,6 @@
           <w:dataBinding w:prefixMappings="xmlns:ns0='http://purl.org/dc/elements/1.1/' xmlns:ns1='http://schemas.openxmlformats.org/package/2006/metadata/core-properties' " w:xpath="/ns1:coreProperties[1]/ns0:title[1]" w:storeItemID="{6C3C8BC8-F283-45AE-878A-BAB7291924A1}"/>
           <w:text/>
         </w:sdtPr>
-        <w:sdtEndPr/>
         <w:sdtContent>
           <w:tc>
             <w:tcPr>
@@ -1279,7 +1270,7 @@
 </file>
 
 <file path=word/numbering.xml><?xml version="1.0" encoding="utf-8"?>
-<w:numbering xmlns:wpc="http://schemas.microsoft.com/office/word/2010/wordprocessingCanvas" xmlns:cx="http://schemas.microsoft.com/office/drawing/2014/chartex" xmlns:mc="http://schemas.openxmlformats.org/markup-compatibility/2006" xmlns:o="urn:schemas-microsoft-com:office:office" xmlns:r="http://schemas.openxmlformats.org/officeDocument/2006/relationships" xmlns:m="http://schemas.openxmlformats.org/officeDocument/2006/math" xmlns:v="urn:schemas-microsoft-com:vml" xmlns:wp14="http://schemas.microsoft.com/office/word/2010/wordprocessingDrawing" xmlns:wp="http://schemas.openxmlformats.org/drawingml/2006/wordprocessingDrawing" xmlns:w10="urn:schemas-microsoft-com:office:word" xmlns:w="http://schemas.openxmlformats.org/wordprocessingml/2006/main" xmlns:w14="http://schemas.microsoft.com/office/word/2010/wordml" xmlns:w15="http://schemas.microsoft.com/office/word/2012/wordml" xmlns:w16se="http://schemas.microsoft.com/office/word/2015/wordml/symex" xmlns:wpg="http://schemas.microsoft.com/office/word/2010/wordprocessingGroup" xmlns:wpi="http://schemas.microsoft.com/office/word/2010/wordprocessingInk" xmlns:wne="http://schemas.microsoft.com/office/word/2006/wordml" xmlns:wps="http://schemas.microsoft.com/office/word/2010/wordprocessingShape" mc:Ignorable="w14 w15 w16se wp14">
+<w:numbering xmlns:wpc="http://schemas.microsoft.com/office/word/2010/wordprocessingCanvas" xmlns:cx="http://schemas.microsoft.com/office/drawing/2014/chartex" xmlns:cx1="http://schemas.microsoft.com/office/drawing/2015/9/8/chartex" xmlns:cx2="http://schemas.microsoft.com/office/drawing/2015/10/21/chartex" xmlns:cx3="http://schemas.microsoft.com/office/drawing/2016/5/9/chartex" xmlns:cx4="http://schemas.microsoft.com/office/drawing/2016/5/10/chartex" xmlns:cx5="http://schemas.microsoft.com/office/drawing/2016/5/11/chartex" xmlns:cx6="http://schemas.microsoft.com/office/drawing/2016/5/12/chartex" xmlns:cx7="http://schemas.microsoft.com/office/drawing/2016/5/13/chartex" xmlns:cx8="http://schemas.microsoft.com/office/drawing/2016/5/14/chartex" xmlns:mc="http://schemas.openxmlformats.org/markup-compatibility/2006" xmlns:aink="http://schemas.microsoft.com/office/drawing/2016/ink" xmlns:am3d="http://schemas.microsoft.com/office/drawing/2017/model3d" xmlns:o="urn:schemas-microsoft-com:office:office" xmlns:oel="http://schemas.microsoft.com/office/2019/extlst" xmlns:r="http://schemas.openxmlformats.org/officeDocument/2006/relationships" xmlns:m="http://schemas.openxmlformats.org/officeDocument/2006/math" xmlns:v="urn:schemas-microsoft-com:vml" xmlns:wp14="http://schemas.microsoft.com/office/word/2010/wordprocessingDrawing" xmlns:wp="http://schemas.openxmlformats.org/drawingml/2006/wordprocessingDrawing" xmlns:w10="urn:schemas-microsoft-com:office:word" xmlns:w="http://schemas.openxmlformats.org/wordprocessingml/2006/main" xmlns:w14="http://schemas.microsoft.com/office/word/2010/wordml" xmlns:w15="http://schemas.microsoft.com/office/word/2012/wordml" xmlns:w16cex="http://schemas.microsoft.com/office/word/2018/wordml/cex" xmlns:w16cid="http://schemas.microsoft.com/office/word/2016/wordml/cid" xmlns:w16="http://schemas.microsoft.com/office/word/2018/wordml" xmlns:w16du="http://schemas.microsoft.com/office/word/2023/wordml/word16du" xmlns:w16sdtdh="http://schemas.microsoft.com/office/word/2020/wordml/sdtdatahash" xmlns:w16sdtfl="http://schemas.microsoft.com/office/word/2024/wordml/sdtformatlock" xmlns:w16se="http://schemas.microsoft.com/office/word/2015/wordml/symex" xmlns:wpg="http://schemas.microsoft.com/office/word/2010/wordprocessingGroup" xmlns:wpi="http://schemas.microsoft.com/office/word/2010/wordprocessingInk" xmlns:wne="http://schemas.microsoft.com/office/word/2006/wordml" xmlns:wps="http://schemas.microsoft.com/office/word/2010/wordprocessingShape" mc:Ignorable="w14 w15 w16se w16cid w16 w16cex w16sdtdh w16sdtfl w16du wp14">
   <w:abstractNum w:abstractNumId="0" w15:restartNumberingAfterBreak="0">
     <w:nsid w:val="0D9E177C"/>
     <w:multiLevelType w:val="multilevel"/>
@@ -2065,40 +2056,40 @@
       </w:rPr>
     </w:lvl>
   </w:abstractNum>
-  <w:num w:numId="1">
+  <w:num w:numId="1" w16cid:durableId="76833235">
     <w:abstractNumId w:val="4"/>
   </w:num>
-  <w:num w:numId="2">
+  <w:num w:numId="2" w16cid:durableId="1889992805">
     <w:abstractNumId w:val="5"/>
   </w:num>
-  <w:num w:numId="3">
+  <w:num w:numId="3" w16cid:durableId="510602464">
     <w:abstractNumId w:val="5"/>
   </w:num>
-  <w:num w:numId="4">
+  <w:num w:numId="4" w16cid:durableId="68889123">
     <w:abstractNumId w:val="5"/>
   </w:num>
-  <w:num w:numId="5">
+  <w:num w:numId="5" w16cid:durableId="395326523">
     <w:abstractNumId w:val="5"/>
   </w:num>
-  <w:num w:numId="6">
+  <w:num w:numId="6" w16cid:durableId="2015374176">
     <w:abstractNumId w:val="2"/>
   </w:num>
-  <w:num w:numId="7">
+  <w:num w:numId="7" w16cid:durableId="1000743040">
     <w:abstractNumId w:val="5"/>
   </w:num>
-  <w:num w:numId="8">
+  <w:num w:numId="8" w16cid:durableId="1853372517">
     <w:abstractNumId w:val="5"/>
   </w:num>
-  <w:num w:numId="9">
+  <w:num w:numId="9" w16cid:durableId="1508251481">
     <w:abstractNumId w:val="0"/>
   </w:num>
-  <w:num w:numId="10">
+  <w:num w:numId="10" w16cid:durableId="1811095845">
     <w:abstractNumId w:val="1"/>
   </w:num>
-  <w:num w:numId="11">
+  <w:num w:numId="11" w16cid:durableId="1811436316">
     <w:abstractNumId w:val="3"/>
   </w:num>
-  <w:num w:numId="12">
+  <w:num w:numId="12" w16cid:durableId="1265455038">
     <w:abstractNumId w:val="3"/>
     <w:lvlOverride w:ilvl="0">
       <w:startOverride w:val="1"/>
@@ -2109,7 +2100,7 @@
 </file>
 
 <file path=word/styles.xml><?xml version="1.0" encoding="utf-8"?>
-<w:styles xmlns:mc="http://schemas.openxmlformats.org/markup-compatibility/2006" xmlns:r="http://schemas.openxmlformats.org/officeDocument/2006/relationships" xmlns:w="http://schemas.openxmlformats.org/wordprocessingml/2006/main" xmlns:w14="http://schemas.microsoft.com/office/word/2010/wordml" xmlns:w15="http://schemas.microsoft.com/office/word/2012/wordml" xmlns:w16se="http://schemas.microsoft.com/office/word/2015/wordml/symex" mc:Ignorable="w14 w15 w16se">
+<w:styles xmlns:mc="http://schemas.openxmlformats.org/markup-compatibility/2006" xmlns:r="http://schemas.openxmlformats.org/officeDocument/2006/relationships" xmlns:w="http://schemas.openxmlformats.org/wordprocessingml/2006/main" xmlns:w14="http://schemas.microsoft.com/office/word/2010/wordml" xmlns:w15="http://schemas.microsoft.com/office/word/2012/wordml" xmlns:w16cex="http://schemas.microsoft.com/office/word/2018/wordml/cex" xmlns:w16cid="http://schemas.microsoft.com/office/word/2016/wordml/cid" xmlns:w16="http://schemas.microsoft.com/office/word/2018/wordml" xmlns:w16du="http://schemas.microsoft.com/office/word/2023/wordml/word16du" xmlns:w16sdtdh="http://schemas.microsoft.com/office/word/2020/wordml/sdtdatahash" xmlns:w16sdtfl="http://schemas.microsoft.com/office/word/2024/wordml/sdtformatlock" xmlns:w16se="http://schemas.microsoft.com/office/word/2015/wordml/symex" mc:Ignorable="w14 w15 w16se w16cid w16 w16cex w16sdtdh w16sdtfl w16du">
   <w:docDefaults>
     <w:rPrDefault>
       <w:rPr>
@@ -2119,7 +2110,7 @@
     </w:rPrDefault>
     <w:pPrDefault/>
   </w:docDefaults>
-  <w:latentStyles w:defLockedState="0" w:defUIPriority="99" w:defSemiHidden="0" w:defUnhideWhenUsed="0" w:defQFormat="0" w:count="371">
+  <w:latentStyles w:defLockedState="0" w:defUIPriority="99" w:defSemiHidden="0" w:defUnhideWhenUsed="0" w:defQFormat="0" w:count="376">
     <w:lsdException w:name="Normal" w:uiPriority="0"/>
     <w:lsdException w:name="heading 1" w:uiPriority="0"/>
     <w:lsdException w:name="heading 2" w:uiPriority="9"/>
@@ -2491,6 +2482,11 @@
     <w:lsdException w:name="List Table 5 Dark Accent 6" w:uiPriority="50"/>
     <w:lsdException w:name="List Table 6 Colorful Accent 6" w:uiPriority="51"/>
     <w:lsdException w:name="List Table 7 Colorful Accent 6" w:uiPriority="52"/>
+    <w:lsdException w:name="Mention" w:semiHidden="1" w:unhideWhenUsed="1"/>
+    <w:lsdException w:name="Smart Hyperlink" w:semiHidden="1" w:unhideWhenUsed="1"/>
+    <w:lsdException w:name="Hashtag" w:semiHidden="1" w:unhideWhenUsed="1"/>
+    <w:lsdException w:name="Unresolved Mention" w:semiHidden="1" w:unhideWhenUsed="1"/>
+    <w:lsdException w:name="Smart Link" w:semiHidden="1" w:unhideWhenUsed="1"/>
   </w:latentStyles>
   <w:style w:type="paragraph" w:default="1" w:styleId="Normal">
     <w:name w:val="Normal"/>
@@ -3498,8 +3494,8 @@
       </w:tblBorders>
     </w:tblPr>
   </w:style>
-  <w:style w:type="character" w:customStyle="1" w:styleId="UnresolvedMention">
-    <w:name w:val="Unresolved Mention"/>
+  <w:style w:type="character" w:customStyle="1" w:styleId="MenoPendente1">
+    <w:name w:val="Menção Pendente1"/>
     <w:basedOn w:val="Fontepargpadro"/>
     <w:uiPriority w:val="99"/>
     <w:semiHidden/>

</xml_diff>

<commit_message>
Diversas alterações após checklist
Foram feitos os refinamentos finais para os artefatos analisados no checklist de fase de elaboração do spinoff.
</commit_message>
<xml_diff>
--- a/1.Requisitos/Casos de Uso/INST360 - História de Usuário 1.docx
+++ b/1.Requisitos/Casos de Uso/INST360 - História de Usuário 1.docx
@@ -43,7 +43,10 @@
         <w:t xml:space="preserve">estimativa: </w:t>
       </w:r>
       <w:r>
-        <w:t>2h</w:t>
+        <w:t>10</w:t>
+      </w:r>
+      <w:r>
+        <w:t>h</w:t>
       </w:r>
     </w:p>
     <w:p>
@@ -885,6 +888,7 @@
           <w:bCs/>
           <w:i w:val="0"/>
           <w:iCs/>
+          <w:noProof/>
           <w:color w:val="auto"/>
         </w:rPr>
         <w:drawing>

</xml_diff>